<commit_message>
Added the place name
</commit_message>
<xml_diff>
--- a/Suriya new word.docx
+++ b/Suriya new word.docx
@@ -20,13 +20,8 @@
         <w:spacing w:after="120" w:line="240" w:lineRule="auto"/>
       </w:pPr>
       <w:r>
-        <w:t xml:space="preserve">Suriya </w:t>
-      </w:r>
-      <w:proofErr w:type="spellStart"/>
-      <w:r>
-        <w:t>Prakash.A</w:t>
-      </w:r>
-      <w:proofErr w:type="spellEnd"/>
+        <w:t>Suriya Prakash.A</w:t>
+      </w:r>
     </w:p>
     <w:p>
       <w:pPr>
@@ -41,23 +36,7 @@
           <w:b w:val="0"/>
           <w:bCs w:val="0"/>
         </w:rPr>
-        <w:t xml:space="preserve">2-8-2 </w:t>
-      </w:r>
-      <w:proofErr w:type="spellStart"/>
-      <w:r>
-        <w:rPr>
-          <w:b w:val="0"/>
-          <w:bCs w:val="0"/>
-        </w:rPr>
-        <w:t>Nadaraja</w:t>
-      </w:r>
-      <w:proofErr w:type="spellEnd"/>
-      <w:r>
-        <w:rPr>
-          <w:b w:val="0"/>
-          <w:bCs w:val="0"/>
-        </w:rPr>
-        <w:t xml:space="preserve"> Puram</w:t>
+        <w:t>2-8-2 Nadaraja Puram</w:t>
       </w:r>
     </w:p>
     <w:p>
@@ -84,21 +63,12 @@
           <w:bCs w:val="0"/>
         </w:rPr>
       </w:pPr>
-      <w:proofErr w:type="spellStart"/>
-      <w:r>
-        <w:rPr>
-          <w:b w:val="0"/>
-          <w:bCs w:val="0"/>
-        </w:rPr>
-        <w:t>Shencottai</w:t>
-      </w:r>
-      <w:proofErr w:type="spellEnd"/>
-      <w:r>
-        <w:rPr>
-          <w:b w:val="0"/>
-          <w:bCs w:val="0"/>
-        </w:rPr>
-        <w:t xml:space="preserve"> </w:t>
+      <w:r>
+        <w:rPr>
+          <w:b w:val="0"/>
+          <w:bCs w:val="0"/>
+        </w:rPr>
+        <w:t xml:space="preserve">Shencottai </w:t>
       </w:r>
     </w:p>
     <w:p>
@@ -109,7 +79,6 @@
           <w:bCs w:val="0"/>
         </w:rPr>
       </w:pPr>
-      <w:proofErr w:type="spellStart"/>
       <w:r>
         <w:rPr>
           <w:b w:val="0"/>
@@ -117,7 +86,6 @@
         </w:rPr>
         <w:t>Tenkasi</w:t>
       </w:r>
-      <w:proofErr w:type="spellEnd"/>
     </w:p>
     <w:p>
       <w:pPr>
@@ -571,21 +539,12 @@
                 <w:bCs w:val="0"/>
               </w:rPr>
             </w:pPr>
-            <w:proofErr w:type="spellStart"/>
             <w:r>
               <w:rPr>
                 <w:b w:val="0"/>
                 <w:bCs w:val="0"/>
               </w:rPr>
-              <w:t>Nagarcoil</w:t>
-            </w:r>
-            <w:proofErr w:type="spellEnd"/>
-            <w:r>
-              <w:rPr>
-                <w:b w:val="0"/>
-                <w:bCs w:val="0"/>
-              </w:rPr>
-              <w:t xml:space="preserve">                      </w:t>
+              <w:t xml:space="preserve">Nagarcoil                      </w:t>
             </w:r>
           </w:p>
         </w:tc>
@@ -779,64 +738,23 @@
                 <w:b w:val="0"/>
                 <w:bCs w:val="0"/>
               </w:rPr>
-              <w:t xml:space="preserve"> I C </w:t>
+              <w:t xml:space="preserve"> I C I  Government boys hr sec  </w:t>
             </w:r>
-            <w:proofErr w:type="gramStart"/>
+          </w:p>
+          <w:p>
+            <w:pPr>
+              <w:rPr>
+                <w:b w:val="0"/>
+                <w:bCs w:val="0"/>
+              </w:rPr>
+            </w:pPr>
             <w:r>
               <w:rPr>
                 <w:b w:val="0"/>
                 <w:bCs w:val="0"/>
               </w:rPr>
-              <w:t>I  Government</w:t>
+              <w:t xml:space="preserve">           School tenkasi</w:t>
             </w:r>
-            <w:proofErr w:type="gramEnd"/>
-            <w:r>
-              <w:rPr>
-                <w:b w:val="0"/>
-                <w:bCs w:val="0"/>
-              </w:rPr>
-              <w:t xml:space="preserve"> boys </w:t>
-            </w:r>
-            <w:proofErr w:type="spellStart"/>
-            <w:r>
-              <w:rPr>
-                <w:b w:val="0"/>
-                <w:bCs w:val="0"/>
-              </w:rPr>
-              <w:t>hr</w:t>
-            </w:r>
-            <w:proofErr w:type="spellEnd"/>
-            <w:r>
-              <w:rPr>
-                <w:b w:val="0"/>
-                <w:bCs w:val="0"/>
-              </w:rPr>
-              <w:t xml:space="preserve"> sec  </w:t>
-            </w:r>
-          </w:p>
-          <w:p>
-            <w:pPr>
-              <w:rPr>
-                <w:b w:val="0"/>
-                <w:bCs w:val="0"/>
-              </w:rPr>
-            </w:pPr>
-            <w:r>
-              <w:rPr>
-                <w:b w:val="0"/>
-                <w:bCs w:val="0"/>
-              </w:rPr>
-              <w:t xml:space="preserve">           School </w:t>
-            </w:r>
-            <w:proofErr w:type="spellStart"/>
-            <w:r>
-              <w:rPr>
-                <w:b w:val="0"/>
-                <w:bCs w:val="0"/>
-              </w:rPr>
-              <w:t>tenkasi</w:t>
-            </w:r>
-            <w:proofErr w:type="spellEnd"/>
           </w:p>
           <w:p>
             <w:pPr>
@@ -1000,48 +918,23 @@
                 <w:b w:val="0"/>
                 <w:bCs w:val="0"/>
               </w:rPr>
-              <w:t xml:space="preserve">Lakshmi </w:t>
+              <w:t>Lakshmi harihara high school</w:t>
             </w:r>
-            <w:proofErr w:type="spellStart"/>
+          </w:p>
+          <w:p>
+            <w:pPr>
+              <w:rPr>
+                <w:b w:val="0"/>
+                <w:bCs w:val="0"/>
+              </w:rPr>
+            </w:pPr>
             <w:r>
               <w:rPr>
                 <w:b w:val="0"/>
                 <w:bCs w:val="0"/>
               </w:rPr>
-              <w:t>harihara</w:t>
+              <w:t xml:space="preserve">                 Elathur</w:t>
             </w:r>
-            <w:proofErr w:type="spellEnd"/>
-            <w:r>
-              <w:rPr>
-                <w:b w:val="0"/>
-                <w:bCs w:val="0"/>
-              </w:rPr>
-              <w:t xml:space="preserve"> high school</w:t>
-            </w:r>
-          </w:p>
-          <w:p>
-            <w:pPr>
-              <w:rPr>
-                <w:b w:val="0"/>
-                <w:bCs w:val="0"/>
-              </w:rPr>
-            </w:pPr>
-            <w:r>
-              <w:rPr>
-                <w:b w:val="0"/>
-                <w:bCs w:val="0"/>
-              </w:rPr>
-              <w:t xml:space="preserve">                 </w:t>
-            </w:r>
-            <w:proofErr w:type="spellStart"/>
-            <w:r>
-              <w:rPr>
-                <w:b w:val="0"/>
-                <w:bCs w:val="0"/>
-              </w:rPr>
-              <w:t>Elathur</w:t>
-            </w:r>
-            <w:proofErr w:type="spellEnd"/>
           </w:p>
         </w:tc>
         <w:tc>
@@ -1205,23 +1098,7 @@
           <w:b w:val="0"/>
           <w:bCs w:val="0"/>
         </w:rPr>
-        <w:t xml:space="preserve">Good </w:t>
-      </w:r>
-      <w:proofErr w:type="gramStart"/>
-      <w:r>
-        <w:rPr>
-          <w:b w:val="0"/>
-          <w:bCs w:val="0"/>
-        </w:rPr>
-        <w:t>Problem Solving</w:t>
-      </w:r>
-      <w:proofErr w:type="gramEnd"/>
-      <w:r>
-        <w:rPr>
-          <w:b w:val="0"/>
-          <w:bCs w:val="0"/>
-        </w:rPr>
-        <w:t xml:space="preserve"> skills</w:t>
+        <w:t>Good Problem Solving skills</w:t>
       </w:r>
     </w:p>
     <w:p>
@@ -1305,23 +1182,7 @@
           <w:b w:val="0"/>
           <w:bCs w:val="0"/>
         </w:rPr>
-        <w:t xml:space="preserve"> </w:t>
-      </w:r>
-      <w:proofErr w:type="spellStart"/>
-      <w:r>
-        <w:rPr>
-          <w:b w:val="0"/>
-          <w:bCs w:val="0"/>
-        </w:rPr>
-        <w:t>Ms</w:t>
-      </w:r>
-      <w:proofErr w:type="spellEnd"/>
-      <w:r>
-        <w:rPr>
-          <w:b w:val="0"/>
-          <w:bCs w:val="0"/>
-        </w:rPr>
-        <w:t xml:space="preserve"> office</w:t>
+        <w:t xml:space="preserve"> Ms office</w:t>
       </w:r>
     </w:p>
     <w:p>
@@ -1760,33 +1621,8 @@
           <w:bCs w:val="0"/>
         </w:rPr>
         <w:tab/>
-        <w:t xml:space="preserve">             </w:t>
-      </w:r>
-      <w:proofErr w:type="gramStart"/>
-      <w:r>
-        <w:rPr>
-          <w:b w:val="0"/>
-          <w:bCs w:val="0"/>
-        </w:rPr>
-        <w:t xml:space="preserve">  :</w:t>
-      </w:r>
-      <w:proofErr w:type="gramEnd"/>
-      <w:r>
-        <w:rPr>
-          <w:b w:val="0"/>
-          <w:bCs w:val="0"/>
-        </w:rPr>
-        <w:t xml:space="preserve">      Suriya </w:t>
-      </w:r>
-      <w:proofErr w:type="spellStart"/>
-      <w:r>
-        <w:rPr>
-          <w:b w:val="0"/>
-          <w:bCs w:val="0"/>
-        </w:rPr>
-        <w:t>Prakash.A</w:t>
-      </w:r>
-      <w:proofErr w:type="spellEnd"/>
+        <w:t xml:space="preserve">               :      Suriya Prakash.A</w:t>
+      </w:r>
     </w:p>
     <w:p>
       <w:pPr>
@@ -1810,31 +1646,29 @@
         </w:rPr>
         <w:t xml:space="preserve">  </w:t>
       </w:r>
-      <w:proofErr w:type="gramStart"/>
-      <w:r>
-        <w:rPr>
-          <w:b w:val="0"/>
-          <w:bCs w:val="0"/>
-        </w:rPr>
-        <w:t xml:space="preserve">  :</w:t>
-      </w:r>
-      <w:proofErr w:type="gramEnd"/>
-      <w:r>
-        <w:rPr>
-          <w:b w:val="0"/>
-          <w:bCs w:val="0"/>
-        </w:rPr>
-        <w:t xml:space="preserve">      </w:t>
-      </w:r>
-      <w:proofErr w:type="spellStart"/>
-      <w:r>
-        <w:rPr>
-          <w:b w:val="0"/>
-          <w:bCs w:val="0"/>
-        </w:rPr>
-        <w:t>Ambeth</w:t>
-      </w:r>
-      <w:proofErr w:type="spellEnd"/>
+      <w:r>
+        <w:rPr>
+          <w:b w:val="0"/>
+          <w:bCs w:val="0"/>
+        </w:rPr>
+        <w:t xml:space="preserve">  :      Ambeth mani.P</w:t>
+      </w:r>
+    </w:p>
+    <w:p>
+      <w:pPr>
+        <w:spacing w:line="360" w:lineRule="auto"/>
+        <w:rPr>
+          <w:b w:val="0"/>
+          <w:bCs w:val="0"/>
+        </w:rPr>
+      </w:pPr>
+      <w:r>
+        <w:rPr>
+          <w:b w:val="0"/>
+          <w:bCs w:val="0"/>
+        </w:rPr>
+        <w:t xml:space="preserve">.     Date of Birth        </w:t>
+      </w:r>
       <w:r>
         <w:rPr>
           <w:b w:val="0"/>
@@ -1842,17 +1676,13 @@
         </w:rPr>
         <w:t xml:space="preserve"> </w:t>
       </w:r>
-      <w:proofErr w:type="spellStart"/>
-      <w:proofErr w:type="gramStart"/>
-      <w:r>
-        <w:rPr>
-          <w:b w:val="0"/>
-          <w:bCs w:val="0"/>
-        </w:rPr>
-        <w:t>mani.P</w:t>
-      </w:r>
-      <w:proofErr w:type="spellEnd"/>
-      <w:proofErr w:type="gramEnd"/>
+      <w:r>
+        <w:rPr>
+          <w:b w:val="0"/>
+          <w:bCs w:val="0"/>
+        </w:rPr>
+        <w:t xml:space="preserve">     :      05-09-2003</w:t>
+      </w:r>
     </w:p>
     <w:p>
       <w:pPr>
@@ -1867,7 +1697,21 @@
           <w:b w:val="0"/>
           <w:bCs w:val="0"/>
         </w:rPr>
-        <w:t xml:space="preserve">.     Date of Birth        </w:t>
+        <w:t xml:space="preserve">      Marital Status      </w:t>
+      </w:r>
+      <w:r>
+        <w:rPr>
+          <w:b w:val="0"/>
+          <w:bCs w:val="0"/>
+        </w:rPr>
+        <w:t xml:space="preserve">  </w:t>
+      </w:r>
+      <w:r>
+        <w:rPr>
+          <w:b w:val="0"/>
+          <w:bCs w:val="0"/>
+        </w:rPr>
+        <w:t xml:space="preserve">    :     </w:t>
       </w:r>
       <w:r>
         <w:rPr>
@@ -1881,23 +1725,7 @@
           <w:b w:val="0"/>
           <w:bCs w:val="0"/>
         </w:rPr>
-        <w:t xml:space="preserve">   </w:t>
-      </w:r>
-      <w:proofErr w:type="gramStart"/>
-      <w:r>
-        <w:rPr>
-          <w:b w:val="0"/>
-          <w:bCs w:val="0"/>
-        </w:rPr>
-        <w:t xml:space="preserve">  :</w:t>
-      </w:r>
-      <w:proofErr w:type="gramEnd"/>
-      <w:r>
-        <w:rPr>
-          <w:b w:val="0"/>
-          <w:bCs w:val="0"/>
-        </w:rPr>
-        <w:t xml:space="preserve">      05-09-2003</w:t>
+        <w:t xml:space="preserve"> Unmarried</w:t>
       </w:r>
     </w:p>
     <w:p>
@@ -1913,66 +1741,6 @@
           <w:b w:val="0"/>
           <w:bCs w:val="0"/>
         </w:rPr>
-        <w:t xml:space="preserve">      Marital Status      </w:t>
-      </w:r>
-      <w:r>
-        <w:rPr>
-          <w:b w:val="0"/>
-          <w:bCs w:val="0"/>
-        </w:rPr>
-        <w:t xml:space="preserve">  </w:t>
-      </w:r>
-      <w:r>
-        <w:rPr>
-          <w:b w:val="0"/>
-          <w:bCs w:val="0"/>
-        </w:rPr>
-        <w:t xml:space="preserve">  </w:t>
-      </w:r>
-      <w:proofErr w:type="gramStart"/>
-      <w:r>
-        <w:rPr>
-          <w:b w:val="0"/>
-          <w:bCs w:val="0"/>
-        </w:rPr>
-        <w:t xml:space="preserve">  :</w:t>
-      </w:r>
-      <w:proofErr w:type="gramEnd"/>
-      <w:r>
-        <w:rPr>
-          <w:b w:val="0"/>
-          <w:bCs w:val="0"/>
-        </w:rPr>
-        <w:t xml:space="preserve">     </w:t>
-      </w:r>
-      <w:r>
-        <w:rPr>
-          <w:b w:val="0"/>
-          <w:bCs w:val="0"/>
-        </w:rPr>
-        <w:t xml:space="preserve"> </w:t>
-      </w:r>
-      <w:r>
-        <w:rPr>
-          <w:b w:val="0"/>
-          <w:bCs w:val="0"/>
-        </w:rPr>
-        <w:t xml:space="preserve"> Unmarried</w:t>
-      </w:r>
-    </w:p>
-    <w:p>
-      <w:pPr>
-        <w:spacing w:line="360" w:lineRule="auto"/>
-        <w:rPr>
-          <w:b w:val="0"/>
-          <w:bCs w:val="0"/>
-        </w:rPr>
-      </w:pPr>
-      <w:r>
-        <w:rPr>
-          <w:b w:val="0"/>
-          <w:bCs w:val="0"/>
-        </w:rPr>
         <w:t xml:space="preserve">      Nationality</w:t>
       </w:r>
       <w:r>
@@ -1981,23 +1749,7 @@
           <w:bCs w:val="0"/>
         </w:rPr>
         <w:tab/>
-        <w:t xml:space="preserve">            </w:t>
-      </w:r>
-      <w:proofErr w:type="gramStart"/>
-      <w:r>
-        <w:rPr>
-          <w:b w:val="0"/>
-          <w:bCs w:val="0"/>
-        </w:rPr>
-        <w:t xml:space="preserve">  :</w:t>
-      </w:r>
-      <w:proofErr w:type="gramEnd"/>
-      <w:r>
-        <w:rPr>
-          <w:b w:val="0"/>
-          <w:bCs w:val="0"/>
-        </w:rPr>
-        <w:t xml:space="preserve">       Indian</w:t>
+        <w:t xml:space="preserve">              :       Indian</w:t>
       </w:r>
     </w:p>
     <w:p>
@@ -2023,23 +1775,7 @@
           <w:bCs w:val="0"/>
         </w:rPr>
         <w:tab/>
-        <w:t xml:space="preserve">            </w:t>
-      </w:r>
-      <w:proofErr w:type="gramStart"/>
-      <w:r>
-        <w:rPr>
-          <w:b w:val="0"/>
-          <w:bCs w:val="0"/>
-        </w:rPr>
-        <w:t xml:space="preserve">  :</w:t>
-      </w:r>
-      <w:proofErr w:type="gramEnd"/>
-      <w:r>
-        <w:rPr>
-          <w:b w:val="0"/>
-          <w:bCs w:val="0"/>
-        </w:rPr>
-        <w:t xml:space="preserve">       Hindu</w:t>
+        <w:t xml:space="preserve">              :       Hindu</w:t>
       </w:r>
     </w:p>
     <w:p>
@@ -2077,35 +1813,8 @@
           <w:b w:val="0"/>
           <w:bCs w:val="0"/>
         </w:rPr>
-        <w:t xml:space="preserve"> </w:t>
-      </w:r>
-      <w:proofErr w:type="gramStart"/>
-      <w:r>
-        <w:rPr>
-          <w:b w:val="0"/>
-          <w:bCs w:val="0"/>
-        </w:rPr>
-        <w:t xml:space="preserve">  :</w:t>
-      </w:r>
-      <w:proofErr w:type="gramEnd"/>
-      <w:r>
-        <w:rPr>
-          <w:b w:val="0"/>
-          <w:bCs w:val="0"/>
-        </w:rPr>
-        <w:t xml:space="preserve">       </w:t>
-      </w:r>
-      <w:proofErr w:type="spellStart"/>
-      <w:proofErr w:type="gramStart"/>
-      <w:r>
-        <w:rPr>
-          <w:b w:val="0"/>
-          <w:bCs w:val="0"/>
-        </w:rPr>
-        <w:t>English,Tamil</w:t>
-      </w:r>
-      <w:proofErr w:type="spellEnd"/>
-      <w:proofErr w:type="gramEnd"/>
+        <w:t xml:space="preserve">   :       English,Tamil</w:t>
+      </w:r>
       <w:r>
         <w:rPr>
           <w:b w:val="0"/>
@@ -2224,15 +1933,7 @@
         </w:rPr>
       </w:pPr>
       <w:r>
-        <w:t xml:space="preserve">DATE   </w:t>
-      </w:r>
-      <w:proofErr w:type="gramStart"/>
-      <w:r>
-        <w:t xml:space="preserve">  :</w:t>
-      </w:r>
-      <w:proofErr w:type="gramEnd"/>
-      <w:r>
-        <w:t xml:space="preserve">         </w:t>
+        <w:t xml:space="preserve">DATE     :         </w:t>
       </w:r>
       <w:r>
         <w:tab/>
@@ -2256,15 +1957,16 @@
           <w:bCs w:val="0"/>
         </w:rPr>
       </w:pPr>
-      <w:proofErr w:type="gramStart"/>
       <w:r>
         <w:t>PLACE  :</w:t>
       </w:r>
-      <w:proofErr w:type="gramEnd"/>
       <w:r>
         <w:tab/>
       </w:r>
       <w:r>
+        <w:t>Chennai</w:t>
+      </w:r>
+      <w:r>
         <w:tab/>
       </w:r>
       <w:r>
@@ -2286,25 +1988,7 @@
           <w:b w:val="0"/>
           <w:bCs w:val="0"/>
         </w:rPr>
-        <w:t xml:space="preserve">   </w:t>
-      </w:r>
-      <w:proofErr w:type="spellStart"/>
-      <w:proofErr w:type="gramStart"/>
-      <w:r>
-        <w:rPr>
-          <w:b w:val="0"/>
-          <w:bCs w:val="0"/>
-        </w:rPr>
-        <w:t>A.Suriya</w:t>
-      </w:r>
-      <w:proofErr w:type="spellEnd"/>
-      <w:proofErr w:type="gramEnd"/>
-      <w:r>
-        <w:rPr>
-          <w:b w:val="0"/>
-          <w:bCs w:val="0"/>
-        </w:rPr>
-        <w:t xml:space="preserve"> Prakash</w:t>
+        <w:t xml:space="preserve">   A.Suriya Prakash</w:t>
       </w:r>
     </w:p>
     <w:sectPr>

</xml_diff>